<commit_message>
Fix Referral Form Date field placement and abbreviate the month
The office's own filled example showed the Date value belongs in the
wider blank cell after "Date:", not the narrow one immediately after
the label, and uses an abbreviated month ("Sept." not "September").

Co-Authored-By: Claude Sonnet 5 <noreply@anthropic.com>
</commit_message>
<xml_diff>
--- a/src/assets/ReferralFormTemplate.docx
+++ b/src/assets/ReferralFormTemplate.docx
@@ -2715,9 +2715,6 @@
                 <w:sz w:val="18"/>
               </w:rPr>
             </w:pPr>
-            <w:r>
-              <w:t xml:space="preserve">{referralDate}</w:t>
-            </w:r>
           </w:p>
         </w:tc>
         <w:tc>
@@ -2736,6 +2733,9 @@
                 <w:sz w:val="18"/>
               </w:rPr>
             </w:pPr>
+            <w:r>
+              <w:t xml:space="preserve">{referralDate}</w:t>
+            </w:r>
           </w:p>
         </w:tc>
         <w:tc>

</xml_diff>

<commit_message>
Rebuild the Referral Form template from the office's own filled example
Source the printable template from the office's hand-filled worked
example instead of their blank form, replacing each entered value with
a placeholder so the output inherits the exact run formatting Word
applied when they actually typed into it, rather than a blank cell's
defaults.

The "Noted by" signature turned out to be a floating anchored image
over a fixed box, not inline cell content docxtemplater's image-tag
syntax can target — so the signature is now embedded by swapping the
raw image bytes directly and resizing the anchor to fit the real
signature's aspect ratio inside that same box, dropping the now-unused
docxtemplater-image-module-free dependency.

Co-Authored-By: Claude Sonnet 5 <noreply@anthropic.com>
</commit_message>
<xml_diff>
--- a/src/assets/ReferralFormTemplate.docx
+++ b/src/assets/ReferralFormTemplate.docx
@@ -335,6 +335,7 @@
               <w:bottom w:val="single" w:sz="4" w:space="0" w:color="auto"/>
               <w:right w:val="nil"/>
             </w:tcBorders>
+            <w:vAlign w:val="bottom"/>
           </w:tcPr>
           <w:p>
             <w:pPr>
@@ -345,7 +346,10 @@
               </w:rPr>
             </w:pPr>
             <w:r>
-              <w:t xml:space="preserve">{name}</w:t>
+              <w:rPr>
+                <w:sz w:val="18"/>
+              </w:rPr>
+              <w:t>{name}</w:t>
             </w:r>
           </w:p>
         </w:tc>
@@ -567,17 +571,21 @@
               <w:bottom w:val="single" w:sz="4" w:space="0" w:color="auto"/>
               <w:right w:val="nil"/>
             </w:tcBorders>
-          </w:tcPr>
-          <w:p>
-            <w:pPr>
-              <w:jc w:val="center"/>
-              <w:rPr>
-                <w:b/>
-                <w:sz w:val="20"/>
-              </w:rPr>
-            </w:pPr>
-            <w:r>
-              <w:t xml:space="preserve">{courseYear}</w:t>
+            <w:vAlign w:val="bottom"/>
+          </w:tcPr>
+          <w:p>
+            <w:pPr>
+              <w:jc w:val="center"/>
+              <w:rPr>
+                <w:b/>
+                <w:sz w:val="18"/>
+              </w:rPr>
+            </w:pPr>
+            <w:r>
+              <w:rPr>
+                <w:sz w:val="18"/>
+              </w:rPr>
+              <w:t>{courseYear}</w:t>
             </w:r>
           </w:p>
         </w:tc>
@@ -652,11 +660,12 @@
             <w:tcW w:w="3827" w:type="dxa"/>
             <w:gridSpan w:val="9"/>
             <w:tcBorders>
-              <w:top w:val="single" w:sz="4" w:space="0" w:color="auto"/>
+              <w:top w:val="nil"/>
               <w:left w:val="nil"/>
               <w:bottom w:val="single" w:sz="4" w:space="0" w:color="auto"/>
               <w:right w:val="nil"/>
             </w:tcBorders>
+            <w:vAlign w:val="bottom"/>
           </w:tcPr>
           <w:p>
             <w:pPr>
@@ -667,7 +676,10 @@
               </w:rPr>
             </w:pPr>
             <w:r>
-              <w:t xml:space="preserve">{school}</w:t>
+              <w:rPr>
+                <w:sz w:val="18"/>
+              </w:rPr>
+              <w:t>{school}</w:t>
             </w:r>
           </w:p>
         </w:tc>
@@ -747,6 +759,7 @@
               <w:bottom w:val="single" w:sz="4" w:space="0" w:color="auto"/>
               <w:right w:val="nil"/>
             </w:tcBorders>
+            <w:vAlign w:val="bottom"/>
           </w:tcPr>
           <w:p>
             <w:pPr>
@@ -756,9 +769,14 @@
                 <w:sz w:val="20"/>
               </w:rPr>
             </w:pPr>
-            <w:r>
-              <w:t xml:space="preserve">{barangay}</w:t>
-            </w:r>
+            <w:proofErr w:type="spellStart"/>
+            <w:r>
+              <w:rPr>
+                <w:sz w:val="18"/>
+              </w:rPr>
+              <w:t>{barangay}</w:t>
+            </w:r>
+            <w:proofErr w:type="spellEnd"/>
           </w:p>
         </w:tc>
         <w:tc>
@@ -837,6 +855,7 @@
               <w:bottom w:val="single" w:sz="4" w:space="0" w:color="auto"/>
               <w:right w:val="nil"/>
             </w:tcBorders>
+            <w:vAlign w:val="bottom"/>
           </w:tcPr>
           <w:p>
             <w:pPr>
@@ -847,7 +866,10 @@
               </w:rPr>
             </w:pPr>
             <w:r>
-              <w:t xml:space="preserve">{contactNo}</w:t>
+              <w:rPr>
+                <w:sz w:val="18"/>
+              </w:rPr>
+              <w:t>{contactNo}</w:t>
             </w:r>
           </w:p>
         </w:tc>
@@ -931,14 +953,98 @@
                 <w:sz w:val="18"/>
                 <w:szCs w:val="16"/>
               </w:rPr>
-              <w:t xml:space="preserve">{cbRetained} Retained</w:t>
+              <w:t xml:space="preserve"> </w:t>
             </w:r>
             <w:r>
               <w:rPr>
                 <w:sz w:val="18"/>
                 <w:szCs w:val="16"/>
               </w:rPr>
-              <w:t xml:space="preserve">  {cbOnProbation} On Probation   {cbSpecialRecon} Special Reconsideration</w:t>
+              <w:t>{cbRetained}</w:t>
+            </w:r>
+            <w:r>
+              <w:rPr>
+                <w:sz w:val="18"/>
+                <w:szCs w:val="16"/>
+              </w:rPr>
+              <w:t xml:space="preserve"> </w:t>
+            </w:r>
+            <w:r>
+              <w:rPr>
+                <w:sz w:val="18"/>
+                <w:szCs w:val="16"/>
+              </w:rPr>
+              <w:t>Retained</w:t>
+            </w:r>
+            <w:r>
+              <w:rPr>
+                <w:sz w:val="18"/>
+                <w:szCs w:val="16"/>
+              </w:rPr>
+              <w:t xml:space="preserve">  </w:t>
+            </w:r>
+            <w:r>
+              <w:rPr>
+                <w:sz w:val="18"/>
+                <w:szCs w:val="16"/>
+              </w:rPr>
+              <w:t xml:space="preserve">  </w:t>
+            </w:r>
+            <w:r>
+              <w:rPr>
+                <w:sz w:val="18"/>
+                <w:szCs w:val="16"/>
+              </w:rPr>
+              <w:t>{cbOnProbation}</w:t>
+            </w:r>
+            <w:r>
+              <w:rPr>
+                <w:sz w:val="18"/>
+                <w:szCs w:val="16"/>
+              </w:rPr>
+              <w:t xml:space="preserve"> </w:t>
+            </w:r>
+            <w:r>
+              <w:rPr>
+                <w:sz w:val="18"/>
+                <w:szCs w:val="16"/>
+              </w:rPr>
+              <w:t xml:space="preserve">On Probation </w:t>
+            </w:r>
+            <w:r>
+              <w:rPr>
+                <w:sz w:val="18"/>
+                <w:szCs w:val="16"/>
+              </w:rPr>
+              <w:t xml:space="preserve"> </w:t>
+            </w:r>
+            <w:r>
+              <w:rPr>
+                <w:sz w:val="18"/>
+                <w:szCs w:val="16"/>
+              </w:rPr>
+              <w:t xml:space="preserve"> </w:t>
+            </w:r>
+            <w:r>
+              <w:rPr>
+                <w:sz w:val="18"/>
+                <w:szCs w:val="16"/>
+              </w:rPr>
+              <w:t>{cbSpecialRecon}</w:t>
+            </w:r>
+            <w:r>
+              <w:rPr>
+                <w:sz w:val="18"/>
+                <w:szCs w:val="16"/>
+              </w:rPr>
+              <w:t xml:space="preserve"> </w:t>
+            </w:r>
+            <w:r>
+              <w:rPr>
+                <w:sz w:val="18"/>
+                <w:szCs w:val="16"/>
+              </w:rPr>
+              <w:t>Special Reconsideration</w:t>
             </w:r>
           </w:p>
         </w:tc>
@@ -1047,6 +1153,9 @@
         </w:tc>
       </w:tr>
       <w:tr>
+        <w:trPr>
+          <w:trHeight w:val="260"/>
+        </w:trPr>
         <w:tc>
           <w:tcPr>
             <w:tcW w:w="1413" w:type="dxa"/>
@@ -1207,9 +1316,6 @@
                 <w:sz w:val="14"/>
               </w:rPr>
             </w:pPr>
-            <w:r>
-              <w:t xml:space="preserve">{fs0code}</w:t>
-            </w:r>
           </w:p>
         </w:tc>
         <w:tc>
@@ -1227,9 +1333,6 @@
                 <w:sz w:val="14"/>
               </w:rPr>
             </w:pPr>
-            <w:r>
-              <w:t xml:space="preserve">{fs0sem}</w:t>
-            </w:r>
           </w:p>
         </w:tc>
       </w:tr>
@@ -1247,13 +1350,16 @@
           </w:tcPr>
           <w:p>
             <w:pPr>
-              <w:rPr>
-                <w:i/>
-                <w:sz w:val="18"/>
-              </w:rPr>
-            </w:pPr>
-            <w:r>
-              <w:t xml:space="preserve">{fs0yr}</w:t>
+              <w:jc w:val="center"/>
+              <w:rPr>
+                <w:sz w:val="18"/>
+              </w:rPr>
+            </w:pPr>
+            <w:r>
+              <w:rPr>
+                <w:sz w:val="18"/>
+              </w:rPr>
+              <w:t>{fs0code}</w:t>
             </w:r>
           </w:p>
         </w:tc>
@@ -1269,14 +1375,11 @@
           </w:tcPr>
           <w:p>
             <w:pPr>
-              <w:rPr>
-                <w:i/>
-                <w:sz w:val="18"/>
-              </w:rPr>
-            </w:pPr>
-            <w:r>
-              <w:t xml:space="preserve">{fs1code}</w:t>
-            </w:r>
+              <w:jc w:val="center"/>
+              <w:rPr>
+                <w:sz w:val="18"/>
+              </w:rPr>
+            </w:pPr>
           </w:p>
         </w:tc>
         <w:tc>
@@ -1292,13 +1395,16 @@
           </w:tcPr>
           <w:p>
             <w:pPr>
-              <w:rPr>
-                <w:i/>
-                <w:sz w:val="18"/>
-              </w:rPr>
-            </w:pPr>
-            <w:r>
-              <w:t xml:space="preserve">{fs1sem}</w:t>
+              <w:jc w:val="center"/>
+              <w:rPr>
+                <w:sz w:val="18"/>
+              </w:rPr>
+            </w:pPr>
+            <w:r>
+              <w:rPr>
+                <w:sz w:val="18"/>
+              </w:rPr>
+              <w:t xml:space="preserve">{fs0sem}</w:t>
             </w:r>
           </w:p>
         </w:tc>
@@ -1314,14 +1420,11 @@
           </w:tcPr>
           <w:p>
             <w:pPr>
-              <w:rPr>
-                <w:i/>
-                <w:sz w:val="18"/>
-              </w:rPr>
-            </w:pPr>
-            <w:r>
-              <w:t xml:space="preserve">{fs1yr}</w:t>
-            </w:r>
+              <w:jc w:val="center"/>
+              <w:rPr>
+                <w:sz w:val="18"/>
+              </w:rPr>
+            </w:pPr>
           </w:p>
         </w:tc>
         <w:tc>
@@ -1336,13 +1439,16 @@
           </w:tcPr>
           <w:p>
             <w:pPr>
-              <w:rPr>
-                <w:i/>
-                <w:sz w:val="18"/>
-              </w:rPr>
-            </w:pPr>
-            <w:r>
-              <w:t xml:space="preserve">{fs2code}</w:t>
+              <w:jc w:val="center"/>
+              <w:rPr>
+                <w:sz w:val="18"/>
+              </w:rPr>
+            </w:pPr>
+            <w:r>
+              <w:rPr>
+                <w:sz w:val="18"/>
+              </w:rPr>
+              <w:t xml:space="preserve">{fs0yr}</w:t>
             </w:r>
           </w:p>
         </w:tc>
@@ -1362,9 +1468,6 @@
                 <w:sz w:val="18"/>
               </w:rPr>
             </w:pPr>
-            <w:r>
-              <w:t xml:space="preserve">{fs2sem}</w:t>
-            </w:r>
           </w:p>
         </w:tc>
         <w:tc>
@@ -1380,9 +1483,6 @@
                 <w:sz w:val="18"/>
               </w:rPr>
             </w:pPr>
-            <w:r>
-              <w:t xml:space="preserve">{fs2yr}</w:t>
-            </w:r>
           </w:p>
         </w:tc>
       </w:tr>
@@ -1400,11 +1500,14 @@
           </w:tcPr>
           <w:p>
             <w:pPr>
-              <w:rPr>
-                <w:i/>
-                <w:sz w:val="18"/>
-              </w:rPr>
-            </w:pPr>
+              <w:jc w:val="center"/>
+              <w:rPr>
+                <w:sz w:val="18"/>
+              </w:rPr>
+            </w:pPr>
+            <w:r>
+              <w:t xml:space="preserve">{fs1code}</w:t>
+            </w:r>
           </w:p>
         </w:tc>
         <w:tc>
@@ -1419,8 +1522,8 @@
           </w:tcPr>
           <w:p>
             <w:pPr>
-              <w:rPr>
-                <w:i/>
+              <w:jc w:val="center"/>
+              <w:rPr>
                 <w:sz w:val="18"/>
               </w:rPr>
             </w:pPr>
@@ -1439,11 +1542,14 @@
           </w:tcPr>
           <w:p>
             <w:pPr>
-              <w:rPr>
-                <w:i/>
-                <w:sz w:val="18"/>
-              </w:rPr>
-            </w:pPr>
+              <w:jc w:val="center"/>
+              <w:rPr>
+                <w:sz w:val="18"/>
+              </w:rPr>
+            </w:pPr>
+            <w:r>
+              <w:t xml:space="preserve">{fs1sem}</w:t>
+            </w:r>
           </w:p>
         </w:tc>
         <w:tc>
@@ -1458,8 +1564,8 @@
           </w:tcPr>
           <w:p>
             <w:pPr>
-              <w:rPr>
-                <w:i/>
+              <w:jc w:val="center"/>
+              <w:rPr>
                 <w:sz w:val="18"/>
               </w:rPr>
             </w:pPr>
@@ -1477,11 +1583,14 @@
           </w:tcPr>
           <w:p>
             <w:pPr>
-              <w:rPr>
-                <w:i/>
-                <w:sz w:val="18"/>
-              </w:rPr>
-            </w:pPr>
+              <w:jc w:val="center"/>
+              <w:rPr>
+                <w:sz w:val="18"/>
+              </w:rPr>
+            </w:pPr>
+            <w:r>
+              <w:t xml:space="preserve">{fs1yr}</w:t>
+            </w:r>
           </w:p>
         </w:tc>
         <w:tc>
@@ -1532,11 +1641,14 @@
           </w:tcPr>
           <w:p>
             <w:pPr>
-              <w:rPr>
-                <w:i/>
-                <w:sz w:val="18"/>
-              </w:rPr>
-            </w:pPr>
+              <w:jc w:val="center"/>
+              <w:rPr>
+                <w:sz w:val="18"/>
+              </w:rPr>
+            </w:pPr>
+            <w:r>
+              <w:t xml:space="preserve">{fs2code}</w:t>
+            </w:r>
           </w:p>
         </w:tc>
         <w:tc>
@@ -1551,8 +1663,8 @@
           </w:tcPr>
           <w:p>
             <w:pPr>
-              <w:rPr>
-                <w:i/>
+              <w:jc w:val="center"/>
+              <w:rPr>
                 <w:sz w:val="18"/>
               </w:rPr>
             </w:pPr>
@@ -1571,11 +1683,14 @@
           </w:tcPr>
           <w:p>
             <w:pPr>
-              <w:rPr>
-                <w:i/>
-                <w:sz w:val="18"/>
-              </w:rPr>
-            </w:pPr>
+              <w:jc w:val="center"/>
+              <w:rPr>
+                <w:sz w:val="18"/>
+              </w:rPr>
+            </w:pPr>
+            <w:r>
+              <w:t xml:space="preserve">{fs2sem}</w:t>
+            </w:r>
           </w:p>
         </w:tc>
         <w:tc>
@@ -1590,8 +1705,8 @@
           </w:tcPr>
           <w:p>
             <w:pPr>
-              <w:rPr>
-                <w:i/>
+              <w:jc w:val="center"/>
+              <w:rPr>
                 <w:sz w:val="18"/>
               </w:rPr>
             </w:pPr>
@@ -1609,11 +1724,14 @@
           </w:tcPr>
           <w:p>
             <w:pPr>
-              <w:rPr>
-                <w:i/>
-                <w:sz w:val="18"/>
-              </w:rPr>
-            </w:pPr>
+              <w:jc w:val="center"/>
+              <w:rPr>
+                <w:sz w:val="18"/>
+              </w:rPr>
+            </w:pPr>
+            <w:r>
+              <w:t xml:space="preserve">{fs2yr}</w:t>
+            </w:r>
           </w:p>
         </w:tc>
         <w:tc>
@@ -1936,9 +2054,6 @@
                 <w:sz w:val="14"/>
               </w:rPr>
             </w:pPr>
-            <w:r>
-              <w:t xml:space="preserve">{lg0code}</w:t>
-            </w:r>
           </w:p>
         </w:tc>
         <w:tc>
@@ -1956,9 +2071,6 @@
                 <w:sz w:val="14"/>
               </w:rPr>
             </w:pPr>
-            <w:r>
-              <w:t xml:space="preserve">{lg0sem}</w:t>
-            </w:r>
           </w:p>
         </w:tc>
       </w:tr>
@@ -1976,13 +2088,13 @@
           </w:tcPr>
           <w:p>
             <w:pPr>
-              <w:rPr>
-                <w:i/>
-                <w:sz w:val="18"/>
-              </w:rPr>
-            </w:pPr>
-            <w:r>
-              <w:t xml:space="preserve">{lg0yr}</w:t>
+              <w:jc w:val="center"/>
+              <w:rPr>
+                <w:sz w:val="18"/>
+              </w:rPr>
+            </w:pPr>
+            <w:r>
+              <w:t xml:space="preserve">{lg0code}</w:t>
             </w:r>
           </w:p>
         </w:tc>
@@ -1998,14 +2110,11 @@
           </w:tcPr>
           <w:p>
             <w:pPr>
-              <w:rPr>
-                <w:i/>
-                <w:sz w:val="18"/>
-              </w:rPr>
-            </w:pPr>
-            <w:r>
-              <w:t xml:space="preserve">{lg1code}</w:t>
-            </w:r>
+              <w:jc w:val="center"/>
+              <w:rPr>
+                <w:sz w:val="18"/>
+              </w:rPr>
+            </w:pPr>
           </w:p>
         </w:tc>
         <w:tc>
@@ -2021,13 +2130,13 @@
           </w:tcPr>
           <w:p>
             <w:pPr>
-              <w:rPr>
-                <w:i/>
-                <w:sz w:val="18"/>
-              </w:rPr>
-            </w:pPr>
-            <w:r>
-              <w:t xml:space="preserve">{lg1sem}</w:t>
+              <w:jc w:val="center"/>
+              <w:rPr>
+                <w:sz w:val="18"/>
+              </w:rPr>
+            </w:pPr>
+            <w:r>
+              <w:t xml:space="preserve">{lg0sem}</w:t>
             </w:r>
           </w:p>
         </w:tc>
@@ -2043,14 +2152,11 @@
           </w:tcPr>
           <w:p>
             <w:pPr>
-              <w:rPr>
-                <w:i/>
-                <w:sz w:val="18"/>
-              </w:rPr>
-            </w:pPr>
-            <w:r>
-              <w:t xml:space="preserve">{lg1yr}</w:t>
-            </w:r>
+              <w:jc w:val="center"/>
+              <w:rPr>
+                <w:sz w:val="18"/>
+              </w:rPr>
+            </w:pPr>
           </w:p>
         </w:tc>
         <w:tc>
@@ -2065,13 +2171,13 @@
           </w:tcPr>
           <w:p>
             <w:pPr>
-              <w:rPr>
-                <w:i/>
-                <w:sz w:val="18"/>
-              </w:rPr>
-            </w:pPr>
-            <w:r>
-              <w:t xml:space="preserve">{lg2code}</w:t>
+              <w:jc w:val="center"/>
+              <w:rPr>
+                <w:sz w:val="18"/>
+              </w:rPr>
+            </w:pPr>
+            <w:r>
+              <w:t xml:space="preserve">{lg0yr}</w:t>
             </w:r>
           </w:p>
         </w:tc>
@@ -2091,9 +2197,6 @@
                 <w:sz w:val="18"/>
               </w:rPr>
             </w:pPr>
-            <w:r>
-              <w:t xml:space="preserve">{lg2sem}</w:t>
-            </w:r>
           </w:p>
         </w:tc>
         <w:tc>
@@ -2109,9 +2212,6 @@
                 <w:sz w:val="18"/>
               </w:rPr>
             </w:pPr>
-            <w:r>
-              <w:t xml:space="preserve">{lg2yr}</w:t>
-            </w:r>
           </w:p>
         </w:tc>
       </w:tr>
@@ -2129,11 +2229,14 @@
           </w:tcPr>
           <w:p>
             <w:pPr>
-              <w:rPr>
-                <w:i/>
-                <w:sz w:val="18"/>
-              </w:rPr>
-            </w:pPr>
+              <w:jc w:val="center"/>
+              <w:rPr>
+                <w:sz w:val="18"/>
+              </w:rPr>
+            </w:pPr>
+            <w:r>
+              <w:t xml:space="preserve">{lg1code}</w:t>
+            </w:r>
           </w:p>
         </w:tc>
         <w:tc>
@@ -2148,8 +2251,8 @@
           </w:tcPr>
           <w:p>
             <w:pPr>
-              <w:rPr>
-                <w:i/>
+              <w:jc w:val="center"/>
+              <w:rPr>
                 <w:sz w:val="18"/>
               </w:rPr>
             </w:pPr>
@@ -2168,11 +2271,14 @@
           </w:tcPr>
           <w:p>
             <w:pPr>
-              <w:rPr>
-                <w:i/>
-                <w:sz w:val="18"/>
-              </w:rPr>
-            </w:pPr>
+              <w:jc w:val="center"/>
+              <w:rPr>
+                <w:sz w:val="18"/>
+              </w:rPr>
+            </w:pPr>
+            <w:r>
+              <w:t xml:space="preserve">{lg1sem}</w:t>
+            </w:r>
           </w:p>
         </w:tc>
         <w:tc>
@@ -2187,8 +2293,8 @@
           </w:tcPr>
           <w:p>
             <w:pPr>
-              <w:rPr>
-                <w:i/>
+              <w:jc w:val="center"/>
+              <w:rPr>
                 <w:sz w:val="18"/>
               </w:rPr>
             </w:pPr>
@@ -2206,11 +2312,14 @@
           </w:tcPr>
           <w:p>
             <w:pPr>
-              <w:rPr>
-                <w:i/>
-                <w:sz w:val="18"/>
-              </w:rPr>
-            </w:pPr>
+              <w:jc w:val="center"/>
+              <w:rPr>
+                <w:sz w:val="18"/>
+              </w:rPr>
+            </w:pPr>
+            <w:r>
+              <w:t xml:space="preserve">{lg1yr}</w:t>
+            </w:r>
           </w:p>
         </w:tc>
         <w:tc>
@@ -2261,11 +2370,14 @@
           </w:tcPr>
           <w:p>
             <w:pPr>
-              <w:rPr>
-                <w:i/>
-                <w:sz w:val="18"/>
-              </w:rPr>
-            </w:pPr>
+              <w:jc w:val="center"/>
+              <w:rPr>
+                <w:sz w:val="18"/>
+              </w:rPr>
+            </w:pPr>
+            <w:r>
+              <w:t xml:space="preserve">{lg2code}</w:t>
+            </w:r>
           </w:p>
         </w:tc>
         <w:tc>
@@ -2280,8 +2392,8 @@
           </w:tcPr>
           <w:p>
             <w:pPr>
-              <w:rPr>
-                <w:i/>
+              <w:jc w:val="center"/>
+              <w:rPr>
                 <w:sz w:val="18"/>
               </w:rPr>
             </w:pPr>
@@ -2300,11 +2412,14 @@
           </w:tcPr>
           <w:p>
             <w:pPr>
-              <w:rPr>
-                <w:i/>
-                <w:sz w:val="18"/>
-              </w:rPr>
-            </w:pPr>
+              <w:jc w:val="center"/>
+              <w:rPr>
+                <w:sz w:val="18"/>
+              </w:rPr>
+            </w:pPr>
+            <w:r>
+              <w:t xml:space="preserve">{lg2sem}</w:t>
+            </w:r>
           </w:p>
         </w:tc>
         <w:tc>
@@ -2319,8 +2434,8 @@
           </w:tcPr>
           <w:p>
             <w:pPr>
-              <w:rPr>
-                <w:i/>
+              <w:jc w:val="center"/>
+              <w:rPr>
                 <w:sz w:val="18"/>
               </w:rPr>
             </w:pPr>
@@ -2338,11 +2453,14 @@
           </w:tcPr>
           <w:p>
             <w:pPr>
-              <w:rPr>
-                <w:i/>
-                <w:sz w:val="18"/>
-              </w:rPr>
-            </w:pPr>
+              <w:jc w:val="center"/>
+              <w:rPr>
+                <w:sz w:val="18"/>
+              </w:rPr>
+            </w:pPr>
+            <w:r>
+              <w:t xml:space="preserve">{lg2yr}</w:t>
+            </w:r>
           </w:p>
         </w:tc>
         <w:tc>
@@ -2426,12 +2544,14 @@
           <w:p>
             <w:pPr>
               <w:rPr>
-                <w:i/>
-                <w:sz w:val="18"/>
-              </w:rPr>
-            </w:pPr>
-            <w:r>
-              <w:t xml:space="preserve">{referredByName}</w:t>
+                <w:sz w:val="18"/>
+              </w:rPr>
+            </w:pPr>
+            <w:r>
+              <w:rPr>
+                <w:sz w:val="18"/>
+              </w:rPr>
+              <w:t>{referredByName}</w:t>
             </w:r>
           </w:p>
         </w:tc>
@@ -2561,12 +2681,14 @@
           <w:p>
             <w:pPr>
               <w:rPr>
-                <w:i/>
-                <w:sz w:val="18"/>
-              </w:rPr>
-            </w:pPr>
-            <w:r>
-              <w:t xml:space="preserve">{referredToName}</w:t>
+                <w:sz w:val="18"/>
+              </w:rPr>
+            </w:pPr>
+            <w:r>
+              <w:rPr>
+                <w:sz w:val="18"/>
+              </w:rPr>
+              <w:t>{referredToName}</w:t>
             </w:r>
           </w:p>
         </w:tc>
@@ -2604,15 +2726,70 @@
           </w:tcPr>
           <w:p>
             <w:pPr>
-              <w:rPr>
-                <w:sz w:val="18"/>
-              </w:rPr>
-            </w:pPr>
-            <w:r>
-              <w:rPr>
-                <w:sz w:val="18"/>
-              </w:rPr>
-              <w:t xml:space="preserve">{cbEndorsedProbation} On Probation Status   {cbEndorsedRemoval} Removal   {cbEndorsedRenewal} Renewal</w:t>
+              <w:ind w:right="-322"/>
+              <w:rPr>
+                <w:sz w:val="18"/>
+              </w:rPr>
+            </w:pPr>
+            <w:r>
+              <w:rPr>
+                <w:sz w:val="18"/>
+              </w:rPr>
+              <w:t>{cbEndorsedProbation}</w:t>
+            </w:r>
+            <w:r>
+              <w:rPr>
+                <w:sz w:val="18"/>
+              </w:rPr>
+              <w:t xml:space="preserve"> </w:t>
+            </w:r>
+            <w:r>
+              <w:rPr>
+                <w:sz w:val="18"/>
+              </w:rPr>
+              <w:t xml:space="preserve">On Probation Status </w:t>
+            </w:r>
+            <w:r>
+              <w:rPr>
+                <w:sz w:val="18"/>
+              </w:rPr>
+              <w:t>{cbEndorsedRemoval}</w:t>
+            </w:r>
+            <w:r>
+              <w:rPr>
+                <w:sz w:val="18"/>
+              </w:rPr>
+              <w:t xml:space="preserve"> </w:t>
+            </w:r>
+            <w:r>
+              <w:rPr>
+                <w:sz w:val="18"/>
+              </w:rPr>
+              <w:t xml:space="preserve">Removal </w:t>
+            </w:r>
+            <w:r>
+              <w:rPr>
+                <w:sz w:val="18"/>
+              </w:rPr>
+              <w:t xml:space="preserve"> </w:t>
+            </w:r>
+            <w:r>
+              <w:rPr>
+                <w:sz w:val="18"/>
+              </w:rPr>
+              <w:t>{cbEndorsedRenewal}</w:t>
+            </w:r>
+            <w:r>
+              <w:rPr>
+                <w:sz w:val="18"/>
+              </w:rPr>
+              <w:t xml:space="preserve"> </w:t>
+            </w:r>
+            <w:r>
+              <w:rPr>
+                <w:sz w:val="18"/>
+              </w:rPr>
+              <w:t>Renewal</w:t>
             </w:r>
           </w:p>
         </w:tc>
@@ -2664,7 +2841,72 @@
               </w:rPr>
             </w:pPr>
             <w:r>
-              <w:t>{%signature}</w:t>
+              <w:rPr>
+                <w:noProof/>
+                <w:lang w:val="en-PH"/>
+              </w:rPr>
+              <w:drawing>
+                <wp:anchor distT="0" distB="0" distL="114300" distR="114300" simplePos="0" relativeHeight="251667456" behindDoc="1" locked="0" layoutInCell="1" allowOverlap="1">
+                  <wp:simplePos x="0" y="0"/>
+                  <wp:positionH relativeFrom="column">
+                    <wp:posOffset>254635</wp:posOffset>
+                  </wp:positionH>
+                  <wp:positionV relativeFrom="paragraph">
+                    <wp:posOffset>-48895</wp:posOffset>
+                  </wp:positionV>
+                  <wp:extent cx="1086485" cy="434340"/>
+                  <wp:effectExtent l="0" t="0" r="0" b="0"/>
+                  <wp:wrapNone/>
+                  <wp:docPr id="2" name="Image 2" descr="image"/>
+                  <wp:cNvGraphicFramePr>
+                    <a:graphicFrameLocks xmlns:a="http://schemas.openxmlformats.org/drawingml/2006/main" noChangeAspect="1"/>
+                  </wp:cNvGraphicFramePr>
+                  <a:graphic xmlns:a="http://schemas.openxmlformats.org/drawingml/2006/main">
+                    <a:graphicData uri="http://schemas.openxmlformats.org/drawingml/2006/picture">
+                      <pic:pic xmlns:pic="http://schemas.openxmlformats.org/drawingml/2006/picture">
+                        <pic:nvPicPr>
+                          <pic:cNvPr id="0" name="Picture 1" descr="image"/>
+                          <pic:cNvPicPr>
+                            <a:picLocks noChangeAspect="1" noChangeArrowheads="1"/>
+                          </pic:cNvPicPr>
+                        </pic:nvPicPr>
+                        <pic:blipFill>
+                          <a:blip r:embed="rId7" cstate="print">
+                            <a:extLst>
+                              <a:ext uri="{28A0092B-C50C-407E-A947-70E740481C1C}">
+                                <a14:useLocalDpi xmlns:a14="http://schemas.microsoft.com/office/drawing/2010/main" val="0"/>
+                              </a:ext>
+                            </a:extLst>
+                          </a:blip>
+                          <a:srcRect/>
+                          <a:stretch>
+                            <a:fillRect/>
+                          </a:stretch>
+                        </pic:blipFill>
+                        <pic:spPr bwMode="auto">
+                          <a:xfrm>
+                            <a:off x="0" y="0"/>
+                            <a:ext cx="1086485" cy="434340"/>
+                          </a:xfrm>
+                          <a:prstGeom prst="rect">
+                            <a:avLst/>
+                          </a:prstGeom>
+                          <a:noFill/>
+                          <a:ln>
+                            <a:noFill/>
+                          </a:ln>
+                        </pic:spPr>
+                      </pic:pic>
+                    </a:graphicData>
+                  </a:graphic>
+                  <wp14:sizeRelH relativeFrom="page">
+                    <wp14:pctWidth>0</wp14:pctWidth>
+                  </wp14:sizeRelH>
+                  <wp14:sizeRelV relativeFrom="page">
+                    <wp14:pctHeight>0</wp14:pctHeight>
+                  </wp14:sizeRelV>
+                </wp:anchor>
+              </w:drawing>
             </w:r>
           </w:p>
         </w:tc>
@@ -2729,12 +2971,14 @@
           <w:p>
             <w:pPr>
               <w:rPr>
-                <w:i/>
-                <w:sz w:val="18"/>
-              </w:rPr>
-            </w:pPr>
-            <w:r>
-              <w:t xml:space="preserve">{referralDate}</w:t>
+                <w:sz w:val="18"/>
+              </w:rPr>
+            </w:pPr>
+            <w:r>
+              <w:rPr>
+                <w:sz w:val="16"/>
+              </w:rPr>
+              <w:t>{referralDate}</w:t>
             </w:r>
           </w:p>
         </w:tc>
@@ -2973,6 +3217,8 @@
       <w:pPr>
         <w:ind w:left="-720"/>
       </w:pPr>
+      <w:bookmarkStart w:id="0" w:name="_GoBack"/>
+      <w:bookmarkEnd w:id="0"/>
     </w:p>
     <w:p>
       <w:pPr>
@@ -2999,8 +3245,6 @@
       <w:pPr>
         <w:ind w:left="-720"/>
       </w:pPr>
-      <w:bookmarkStart w:id="0" w:name="_GoBack"/>
-      <w:bookmarkEnd w:id="0"/>
     </w:p>
     <w:p>
       <w:pPr>
@@ -3083,7 +3327,7 @@
       </w:pPr>
     </w:p>
     <w:sectPr>
-      <w:headerReference w:type="default" r:id="rId7"/>
+      <w:headerReference w:type="default" r:id="rId8"/>
       <w:pgSz w:w="12240" w:h="15840"/>
       <w:pgMar w:top="284" w:right="49" w:bottom="1440" w:left="0" w:header="0" w:footer="720" w:gutter="0"/>
       <w:pgNumType w:start="1"/>

</xml_diff>

<commit_message>
Size the Referred by/to names down to 16pt on the Referral Form
Matches the office's own adjustment to the printed sample — the
template's default 18pt was too large for these two fields.

Co-Authored-By: Claude Sonnet 5 <noreply@anthropic.com>
</commit_message>
<xml_diff>
--- a/src/assets/ReferralFormTemplate.docx
+++ b/src/assets/ReferralFormTemplate.docx
@@ -2549,7 +2549,7 @@
             </w:pPr>
             <w:r>
               <w:rPr>
-                <w:sz w:val="18"/>
+                <w:sz w:val="16"/>
               </w:rPr>
               <w:t>{referredByName}</w:t>
             </w:r>
@@ -2686,7 +2686,7 @@
             </w:pPr>
             <w:r>
               <w:rPr>
-                <w:sz w:val="18"/>
+                <w:sz w:val="16"/>
               </w:rPr>
               <w:t>{referredToName}</w:t>
             </w:r>

</xml_diff>

<commit_message>
Fix font size mismatch in positionally-filled matrix rows
Runs inserted into the blank Failed Subjects / Lacking Grades rows had
no explicit run-level size, so they fell back to the style default
instead of matching the office's own filled-in row (Physics 1) — carry
the cell's own paragraph-mark size onto the inserted run explicitly.

Co-Authored-By: Claude Sonnet 5 <noreply@anthropic.com>
</commit_message>
<xml_diff>
--- a/src/assets/ReferralFormTemplate.docx
+++ b/src/assets/ReferralFormTemplate.docx
@@ -1506,6 +1506,9 @@
               </w:rPr>
             </w:pPr>
             <w:r>
+              <w:rPr>
+                <w:sz w:val="18"/>
+              </w:rPr>
               <w:t xml:space="preserve">{fs1code}</w:t>
             </w:r>
           </w:p>
@@ -1548,6 +1551,9 @@
               </w:rPr>
             </w:pPr>
             <w:r>
+              <w:rPr>
+                <w:sz w:val="18"/>
+              </w:rPr>
               <w:t xml:space="preserve">{fs1sem}</w:t>
             </w:r>
           </w:p>
@@ -1589,6 +1595,9 @@
               </w:rPr>
             </w:pPr>
             <w:r>
+              <w:rPr>
+                <w:sz w:val="18"/>
+              </w:rPr>
               <w:t xml:space="preserve">{fs1yr}</w:t>
             </w:r>
           </w:p>
@@ -1647,6 +1656,9 @@
               </w:rPr>
             </w:pPr>
             <w:r>
+              <w:rPr>
+                <w:sz w:val="18"/>
+              </w:rPr>
               <w:t xml:space="preserve">{fs2code}</w:t>
             </w:r>
           </w:p>
@@ -1689,6 +1701,9 @@
               </w:rPr>
             </w:pPr>
             <w:r>
+              <w:rPr>
+                <w:sz w:val="18"/>
+              </w:rPr>
               <w:t xml:space="preserve">{fs2sem}</w:t>
             </w:r>
           </w:p>
@@ -1730,6 +1745,9 @@
               </w:rPr>
             </w:pPr>
             <w:r>
+              <w:rPr>
+                <w:sz w:val="18"/>
+              </w:rPr>
               <w:t xml:space="preserve">{fs2yr}</w:t>
             </w:r>
           </w:p>
@@ -2094,6 +2112,9 @@
               </w:rPr>
             </w:pPr>
             <w:r>
+              <w:rPr>
+                <w:sz w:val="18"/>
+              </w:rPr>
               <w:t xml:space="preserve">{lg0code}</w:t>
             </w:r>
           </w:p>
@@ -2136,6 +2157,9 @@
               </w:rPr>
             </w:pPr>
             <w:r>
+              <w:rPr>
+                <w:sz w:val="18"/>
+              </w:rPr>
               <w:t xml:space="preserve">{lg0sem}</w:t>
             </w:r>
           </w:p>
@@ -2177,6 +2201,9 @@
               </w:rPr>
             </w:pPr>
             <w:r>
+              <w:rPr>
+                <w:sz w:val="18"/>
+              </w:rPr>
               <w:t xml:space="preserve">{lg0yr}</w:t>
             </w:r>
           </w:p>
@@ -2235,6 +2262,9 @@
               </w:rPr>
             </w:pPr>
             <w:r>
+              <w:rPr>
+                <w:sz w:val="18"/>
+              </w:rPr>
               <w:t xml:space="preserve">{lg1code}</w:t>
             </w:r>
           </w:p>
@@ -2277,6 +2307,9 @@
               </w:rPr>
             </w:pPr>
             <w:r>
+              <w:rPr>
+                <w:sz w:val="18"/>
+              </w:rPr>
               <w:t xml:space="preserve">{lg1sem}</w:t>
             </w:r>
           </w:p>
@@ -2318,6 +2351,9 @@
               </w:rPr>
             </w:pPr>
             <w:r>
+              <w:rPr>
+                <w:sz w:val="18"/>
+              </w:rPr>
               <w:t xml:space="preserve">{lg1yr}</w:t>
             </w:r>
           </w:p>
@@ -2376,6 +2412,9 @@
               </w:rPr>
             </w:pPr>
             <w:r>
+              <w:rPr>
+                <w:sz w:val="18"/>
+              </w:rPr>
               <w:t xml:space="preserve">{lg2code}</w:t>
             </w:r>
           </w:p>
@@ -2418,6 +2457,9 @@
               </w:rPr>
             </w:pPr>
             <w:r>
+              <w:rPr>
+                <w:sz w:val="18"/>
+              </w:rPr>
               <w:t xml:space="preserve">{lg2sem}</w:t>
             </w:r>
           </w:p>
@@ -2459,6 +2501,9 @@
               </w:rPr>
             </w:pPr>
             <w:r>
+              <w:rPr>
+                <w:sz w:val="18"/>
+              </w:rPr>
               <w:t xml:space="preserve">{lg2yr}</w:t>
             </w:r>
           </w:p>

</xml_diff>